<commit_message>
Replace blog post Ref 1 with peer-reviewed Ramaswamy et al. Nat Med 2026
Swap OpenAI company blog post for: Ramaswamy, A. et al. ChatGPT Health
performance in a structured test of triage recommendations. Nat. Med.
https://doi.org/10.1038/s41591-026-04297-7 (2026). The paper documents
ChatGPT Health reaching millions of users on launch, directly supporting
the opening claim about AI chatbots becoming patient-facing medical
advice sources, and is published in the same Nature family of journals.

Co-Authored-By: Claude Sonnet 4.6 <noreply@anthropic.com>
</commit_message>
<xml_diff>
--- a/manuscripts/Correspondence_AI_Safety_2026-03-04_revised.docx
+++ b/manuscripts/Correspondence_AI_Safety_2026-03-04_revised.docx
@@ -606,35 +606,20 @@
         </w:rPr>
       </w:pPr>
       <w:r>
-        <w:rPr>
-          <w:rFonts w:ascii="Garamond" w:hAnsi="Garamond"/>
-        </w:rPr>
-        <w:fldChar w:fldCharType="begin"/>
-      </w:r>
-      <w:r>
-        <w:rPr>
-          <w:rFonts w:ascii="Garamond" w:hAnsi="Garamond"/>
-        </w:rPr>
-        <w:instrText xml:space="preserve"> ADDIN ZOTERO_BIBL {"uncited":[],"omitted":[],"custom":[]} CSL_BIBLIOGRAPHY </w:instrText>
-      </w:r>
-      <w:r>
-        <w:rPr>
-          <w:rFonts w:ascii="Garamond" w:hAnsi="Garamond"/>
-        </w:rPr>
-        <w:fldChar w:fldCharType="separate"/>
-      </w:r>
-      <w:r>
-        <w:rPr>
-          <w:rFonts w:ascii="Garamond" w:hAnsi="Garamond"/>
-        </w:rPr>
         <w:t>1.</w:t>
-      </w:r>
-      <w:r>
-        <w:rPr>
-          <w:rFonts w:ascii="Garamond" w:hAnsi="Garamond"/>
-        </w:rPr>
         <w:tab/>
-        <w:t>OpenAI. Introducing ChatGPT Health. https://openai.com/index/introducing-chatgpt-health/ (2026).</w:t>
+      </w:r>
+      <w:r>
+        <w:t xml:space="preserve">Ramaswamy, A. et al. ChatGPT Health performance in a structured test of triage recommendations. </w:t>
+      </w:r>
+      <w:r>
+        <w:rPr>
+          <w:i/>
+        </w:rPr>
+        <w:t>Nat. Med.</w:t>
+      </w:r>
+      <w:r>
+        <w:t xml:space="preserve"> https://doi.org/10.1038/s41591-026-04297-7 (2026).</w:t>
       </w:r>
     </w:p>
     <w:p>

</xml_diff>